<commit_message>
Update explainer docs for templated generation and tonight's bug-fix audit
Both docs previously described Layer 5 as "the model writes every
observation" — now inaccurate, since templated generation means most
flags get no model call at all, and the one that remains is a narrow
addendum check, not full narration. Updated the architecture description,
Cloud Run timing (~30min -> under 10min for an 11-observation report), the
GPU section (quota request now submitted, not just attempted), and
replaced the reverted parallel-workers claim with what actually shipped.

Also documents the extraction/mapping robustness audit as its own new
section in the technical reference: the PDF table-extraction fallback,
Excel sheet-classification fix, digit-splitting fix (both code paths), the
fuzzy-match threshold/candidate-selection audit, the OCR oneDNN crash fix,
and the 16Gi->32Gi memory bump.

Co-Authored-By: Claude Sonnet 5 <noreply@anthropic.com>
</commit_message>
<xml_diff>
--- a/audit-risk-report-generator_full_technical_reference.docx
+++ b/audit-risk-report-generator_full_technical_reference.docx
@@ -95,11 +95,9 @@
         <w:rPr>
           <w:b/>
         </w:rPr>
-        <w:t xml:space="preserve">A local AI model writes only the final sentence (Layer 5) </w:t>
+        <w:t>A local AI model writes, at most, one sentence (Layer 5) For most flags it writes nothing at all: the observation and recommendation are built from a template using the flag's own evidence. Where a model call still happens, it's narrower than before — given the templated fact and the company's actual note text, decide whether the note explains it, and add one qualifying sentence only if it doesn't. See Section 8.</w:t>
       </w:r>
-      <w:r>
-        <w:t>The model receives a rule that has already fired, the exact evidence numbers that triggered it, the exact retrieved text of the relevant accounting standard, and the exact note text — and its only job is to turn that into 3–4 well-written sentences. It is instructed never to use a figure or a paragraph number that wasn't handed to it. This is Layer 5, and only Layer 5.</w:t>
-      </w:r>
+      <w:r/>
     </w:p>
     <w:p>
       <w:pPr>
@@ -1325,11 +1323,9 @@
         <w:rPr>
           <w:b/>
         </w:rPr>
-        <w:t xml:space="preserve">Table extraction, two attempts — </w:t>
+        <w:t>Table extraction, three attempts — for each page, pdfplumber tries table extraction with a line-based strategy first (looking for actual ruled table borders); if that finds nothing, it retries with a text-based strategy (inferring column boundaries from text alignment, for tables with no visible ruling). If both of those return a structurally-shaped table whose label column comes back empty for every row — confirmed on a real filing where the underlying PDF separates columns by whitespace alignment in a way neither pdfplumber strategy resolves correctly — a third fallback reconstructs the table line-by-line directly from the page's plain text instead, which is unaffected by either failure mode.</w:t>
       </w:r>
-      <w:r>
-        <w:t>for each page, pdfplumber tries table extraction with a line-based strategy first (looking for actual ruled table borders); if that finds nothing, it retries with a text-based strategy (inferring column boundaries from text alignment, for tables with no visible ruling — common in real annual reports).</w:t>
-      </w:r>
+      <w:r/>
     </w:p>
     <w:p>
       <w:pPr>
@@ -1821,6 +1817,14 @@
         </w:tc>
       </w:tr>
     </w:tbl>
+    <w:p>
+      <w:pPr>
+        <w:pStyle w:val="ListBullet"/>
+      </w:pPr>
+      <w:r>
+        <w:t>A systematic accuracy audit (prompted by a real false-positive match) cross-checked every fuzzy-match schema variant against every other, then against real filing text. rapidfuzz's WRatio was found to sit at a ~85.5 “baseline generosity” floor for medium-length financial-jargon phrases regardless of actual meaning — 848 cross-key collisions existed at the old threshold of 85 vs. 46 at 90, and every demonstrated real-world false positive scored ~85.5 while genuine matches clustered at 90+. FUZZY_MATCH_THRESHOLD was raised to 90 accordingly, and the candidate-selection logic (formerly ranking a match's method — exact/fuzzy/embedding — above whether it actually had both current and prior year values) now checks completeness first.</w:t>
+      </w:r>
+    </w:p>
     <w:p>
       <w:pPr>
         <w:spacing w:after="160"/>
@@ -3470,7 +3474,10 @@
           <w:i w:val="0"/>
           <w:sz w:val="21"/>
         </w:rPr>
-        <w:t>For each flag, the system prompt instructs the model — in writing — to: (1) only use figures present in the evidence or note content given to it, (2) only cite a standard paragraph number if that number literally appears in the retrieved text, never invent one, and (3) keep recommendations specific (name the actual document or confirmation an auditor should obtain). The model returns a fixed JSON shape (area, observation, risk_rating, standard_reference, recommendation), parsed and validated against the ObservationResult schema; a malformed response gets one retry with an explicit correction instruction appended before the flag is given up on.</w:t>
+        <w:t>Default path (config.LOCAL_LLM_USE_TEMPLATES=True, the current default): pipeline/generator/templates.py builds the observation, recommendation, and standard_reference deterministically from the flag's own evidence dict, for every flag_id with a registered template (currently all ~21 in flags.py/consistency.py — each already carries a known governing standard baked into standard_query at the point the check was written, so there's no real judgment left for a model to make on those three fields). The one model call that remains per flag is the addendum: given the templated fact and the resolved note text, a much smaller prompt (no evidence JSON, no retrieved standard text) asks the model to decide whether the note explains the fact, responding with either one qualifying sentence or the literal word NONE. Measured effect on the reference fixture: llm_generation dropped from ~1780s to ~320-420s for the same 11 flags.</w:t>
+        <w:br/>
+        <w:br/>
+        <w:t>Fallback path (LOCAL_LLM_USE_TEMPLATES=False, or any flag_id without a registered template): the original full-generation call. The system prompt instructs the model — in writing — to: (1) only use figures present in the evidence or note content given to it, (2) only cite a standard paragraph number if that number literally appears in the retrieved text, never invent one, and (3) keep recommendations specific.</w:t>
       </w:r>
     </w:p>
     <w:p>
@@ -3478,7 +3485,7 @@
         <w:pStyle w:val="Heading2"/>
       </w:pPr>
       <w:r>
-        <w:t>Two real bugs found and fixed during testing</w:t>
+        <w:t>Real bugs found and fixed in the generation layer</w:t>
       </w:r>
     </w:p>
     <w:p>
@@ -3540,7 +3547,7 @@
         <w:pStyle w:val="Heading1"/>
       </w:pPr>
       <w:r>
-        <w:t>9. Report Export and the Streamlit Workflow</w:t>
+        <w:t>9. Report Export and the Gradio Workflow</w:t>
       </w:r>
     </w:p>
     <w:p>
@@ -3553,7 +3560,7 @@
           <w:i w:val="0"/>
           <w:sz w:val="21"/>
         </w:rPr>
-        <w:t>The final AuditReport (a validated pydantic model) is rendered two ways: live in the Streamlit app as four tabs (Observations, Key Movements, Ratios, Raw Flags), and as a downloadable Word document via python-docx — a title, disclaimer box, a summary table by risk rating, a colour-coded observations table (light red / amber / green for High / Medium / Low), a key movements table, a ratios table, and a numbered next-steps list drawn from the High and Medium recommendations. The same disclaimer appears on every report, and it's meant literally, not as boilerplate: "Preliminary desk-based observations from analytical review only. Not corroborated through vouching, third-party confirmation, or management inquiry. Validate during fieldwork before inclusion in any final report."</w:t>
+        <w:t>The final AuditReport (a validated pydantic model) is rendered two ways: live in the Gradio app as four tabs (Observations, Key Movements, Ratios, Raw Flags), and as a downloadable Word document via python-docx — a title, disclaimer box, a summary table by risk rating, a colour-coded observations table (light red / amber / green for High / Medium / Low), a key movements table, a ratios table, and a numbered next-steps list drawn from the High and Medium recommendations. The same disclaimer appears on every report, and it's meant literally, not as boilerplate: "Preliminary desk-based observations from analytical review only. Not corroborated through vouching, third-party confirmation, or management inquiry. Validate during fieldwork before inclusion in any final report."</w:t>
       </w:r>
     </w:p>
     <w:p>
@@ -3566,7 +3573,7 @@
           <w:i w:val="0"/>
           <w:sz w:val="21"/>
         </w:rPr>
-        <w:t>Upload flow: a base Excel workbook (Balance Sheet, P&amp;L, Cash Flow — recommended, since numbers read directly from cells are more reliable than numbers pulled from a PDF table) plus a notes/schedules document in PDF, Word, or image format (required, since the note-dependent rules — MSME, CSR, contingent liabilities, ageing schedules — have nothing to check without it). If the notes document also contains the face statements, Excel can be skipped entirely and the pipeline still runs.</w:t>
+        <w:t>Upload flow: an Annual Report / Notes &amp; Schedules document in PDF, Word, or image format (required — this is the whole report, face statements included, not just the notes; the field was renamed from “Notes &amp; Schedules” after a real user upload was rejected despite genuinely containing the right content) plus, optionally, a separate Excel workbook (Balance Sheet, P&amp;L, Cash Flow) if the base financials are available separately — numbers read directly from cells are more reliable than numbers pulled from a PDF table, but aren't required if everything is already in the one PDF.</w:t>
       </w:r>
     </w:p>
     <w:p>
@@ -3658,6 +3665,22 @@
     </w:p>
     <w:p>
       <w:pPr>
+        <w:pStyle w:val="ListBullet"/>
+      </w:pPr>
+      <w:r>
+        <w:t>Google Cloud Run deployment, full pipeline, live browser UI: uploaded the same reference Excel + notes PDF used in the Mac testing above to the deployed Cloud Run URL, waited through the real (CPU-bound) run, and got back the exact same result — 3 High / 7 Medium / 1 Low, 11 observations, same cited figures — confirming the cloud deployment and the local one produce identical output.</w:t>
+      </w:r>
+    </w:p>
+    <w:p>
+      <w:pPr>
+        <w:pStyle w:val="ListBullet"/>
+      </w:pPr>
+      <w:r>
+        <w:t>Templated generation (the replacement for parallel workers, see Section 12): confirmed producing byte-identical risk breakdowns to the full-LLM path on the reference fixture (3 High / 7 Medium / 1 Low, 11 observations) while cutting generation time by roughly 5-6x.</w:t>
+      </w:r>
+    </w:p>
+    <w:p>
+      <w:pPr>
         <w:pStyle w:val="Heading1"/>
       </w:pPr>
       <w:r>
@@ -3714,11 +3737,9 @@
         <w:rPr>
           <w:b/>
         </w:rPr>
-        <w:t xml:space="preserve">Apple Silicon only. </w:t>
+        <w:t>Apple Silicon is the fast path, not the only path. mlx-lm (Metal-accelerated) only runs on Apple Silicon macOS, but the llama.cpp/GGUF backend runs the same model on any CPU and is what both the Google Cloud Run deployment and any non-Mac local machine use — it's just meaningfully slower (minutes per observation on CPU vs. seconds on a Mac's GPU). See Section 12.</w:t>
       </w:r>
-      <w:r>
-        <w:t>mlx-lm — the library running the local model — only works on Apple Silicon macOS. Running this on Windows or Linux would require swapping that one component for an alternative (e.g. Ollama).</w:t>
-      </w:r>
+      <w:r/>
     </w:p>
     <w:p>
       <w:pPr>
@@ -3728,13 +3749,153 @@
         <w:rPr>
           <w:b/>
         </w:rPr>
-        <w:t xml:space="preserve">Extraction quality depends on source formatting. </w:t>
+        <w:t>Extraction quality depends on source formatting. This has gotten materially more robust this session — non-ruled-line PDF tables and Excel workbooks with generic sheet names (e.g. a PDF-to-Excel conversion tool's “Table 1/2/3”) are now both handled — but a company that reformats its tables very unusually, or states figures in a unit other than lakh (the report always labels figures “lakh” regardless of what the source document actually states), may still need manual review.</w:t>
       </w:r>
+      <w:r/>
+    </w:p>
+    <w:p/>
+    <w:p>
+      <w:pPr>
+        <w:pStyle w:val="Heading1"/>
+      </w:pPr>
       <w:r>
-        <w:t>A company that formats its tables unusually may extract less cleanly from a PDF alone — this is exactly why the base Excel upload is recommended, not optional.</w:t>
+        <w:t>12. Cloud Deployment (Google Cloud Run)</w:t>
       </w:r>
     </w:p>
-    <w:p/>
+    <w:p>
+      <w:pPr/>
+      <w:r>
+        <w:t>The same codebase also runs as a hosted Cloud Run service — a Docker image built from a plain python:3.11-slim base, with the standards index and the GGUF model both baked in at build time (not downloaded on first request) so a cold container starts ready to work. Config: 8 vCPU, 24GB memory, scales to zero between reports, one revision at a time.</w:t>
+      </w:r>
+    </w:p>
+    <w:p>
+      <w:pPr>
+        <w:pStyle w:val="Heading2"/>
+      </w:pPr>
+      <w:r>
+        <w:t>Real bugs found and fixed getting this working</w:t>
+      </w:r>
+    </w:p>
+    <w:p>
+      <w:pPr/>
+      <w:r>
+        <w:t>Every one of these was found by actually running a full report against the live deployment, not by inspection.</w:t>
+      </w:r>
+    </w:p>
+    <w:p>
+      <w:pPr>
+        <w:pStyle w:val="ListBullet"/>
+      </w:pPr>
+      <w:r>
+        <w:t>Session affinity: Gradio uploads a file over one HTTP request, then runs the analysis over a separate request — without pinning both to the same Cloud Run instance, the analysis step couldn't find the file the upload step just wrote. Fixed with Cloud Run's --session-affinity flag.</w:t>
+      </w:r>
+    </w:p>
+    <w:p>
+      <w:pPr>
+        <w:pStyle w:val="ListBullet"/>
+      </w:pPr>
+      <w:r>
+        <w:t>Hugging Face Hub rate limit: the code was calling the model-loading function that re-verifies the file against the Hub's API on every cold start, even though the model was already sitting on local disk. That API has a hard 500-requests-per-5-minutes-per-IP limit for unauthenticated calls, and repeated deploys/restarts from one IP hit it, breaking generation outright with a 429. Fixed by loading straight from the local file path when it exists — zero network calls at generation time.</w:t>
+      </w:r>
+    </w:p>
+    <w:p>
+      <w:pPr>
+        <w:pStyle w:val="ListBullet"/>
+      </w:pPr>
+      <w:r>
+        <w:t>Concurrency-starved heartbeat killed long runs: Gradio's frontend polls a lightweight endpoint periodically to detect if the server restarted. At Cloud Run's default concurrency=1, that heartbeat could never get a request slot while the one instance was busy with the real (many-minutes-long) generation call — every heartbeat failed for the whole run, and Gradio's client eventually treated that as "the server restarted" and force-reloaded the page, silently killing a 44-minute in-progress report. Fixed by raising concurrency to 10 — the actual generation work is still serialized to one (or two, with the parallel-worker change below) at a time by the code itself, not by this setting, so this only unblocks housekeeping requests.</w:t>
+      </w:r>
+    </w:p>
+    <w:p>
+      <w:pPr>
+        <w:pStyle w:val="Heading2"/>
+      </w:pPr>
+      <w:r>
+        <w:t>GPU: quota request submitted, pending Google approval</w:t>
+      </w:r>
+    </w:p>
+    <w:p>
+      <w:pPr/>
+      <w:r>
+        <w:t>Cloud Run supports attaching an NVIDIA L4 GPU, which would cut generation time further still. A full CUDA build was completed and validated — correct driver-matched CUDA toolkit version, compilation scoped to just the L4's architecture, and the model-loading code updated to offload every layer to the GPU when one is present. Deployment itself was blocked on this project's Cloud Run GPU quota being hard-capped at zero; a manual quota-increase request (region us-central1, without zonal redundancy, matching the --no-gpu-zonal-redundancy flag already in deploy.sh) has since been submitted through the Cloud Console and is pending Google's review.</w:t>
+      </w:r>
+    </w:p>
+    <w:p>
+      <w:pPr>
+        <w:pStyle w:val="Heading2"/>
+      </w:pPr>
+      <w:r>
+        <w:t>The CPU-only speedup that is live: templated generation</w:t>
+      </w:r>
+    </w:p>
+    <w:p>
+      <w:pPr/>
+      <w:r>
+        <w:t>Generation was originally strictly serial — one model call per flag, every field of every observation written by the model. Running multiple parallel model instances on the same 8 vCPUs was tried first (LOCAL_LLM_N_WORKERS&gt;1, still present in the code, defaulted off) and measured slower, not faster: llama.cpp decoding on CPU is memory-bandwidth-bound, not core-bound, so multiple instances just compete for the same memory bus instead of getting a clean speedup from separate cores (~33.5 min vs. ~29.4 min single-worker baseline on a real run). The change that actually worked was architectural, not concurrency: since every flag's governing standard and fact pattern is already known deterministically (see Section 5's normalization audit and Section 7's rule list), most of each observation no longer needs a model call at all — see Section 8's “Default path” description. A real 11-flag run went from ~1780s of LLM generation to ~320-420s, a larger win on one CPU instance than the parallel-worker approach ever achieved across two.</w:t>
+      </w:r>
+    </w:p>
+    <w:p>
+      <w:pPr>
+        <w:pStyle w:val="Heading1"/>
+      </w:pPr>
+      <w:r>
+        <w:t>13. Extraction and Mapping Robustness Audit</w:t>
+      </w:r>
+    </w:p>
+    <w:p>
+      <w:pPr/>
+      <w:r>
+        <w:t>A round of real user-submitted filings (two NBFC annual reports, different from the reference fixture) surfaced several extraction and mapping bugs that a systematic pass then closed as a set, all confirmed with zero regression on the reference fixture:</w:t>
+      </w:r>
+    </w:p>
+    <w:p>
+      <w:pPr>
+        <w:pStyle w:val="ListBullet"/>
+      </w:pPr>
+      <w:r>
+        <w:t>PDF table extraction silently returned structurally-shaped but entirely empty-labeled tables on pages where columns are separated by whitespace rather than ruled lines — recovered via a text-line reconstruction fallback (Section 3).</w:t>
+      </w:r>
+    </w:p>
+    <w:p>
+      <w:pPr>
+        <w:pStyle w:val="ListBullet"/>
+      </w:pPr>
+      <w:r>
+        <w:t>Excel sheet-type detection relied on sheet name alone, so a PDF-to-Excel export with generically-named sheets ('Table 1/2/3') silently disabled the cross-statement guard for the whole workbook — now falls back to the sheet's own content when the name gives no signal.</w:t>
+      </w:r>
+    </w:p>
+    <w:p>
+      <w:pPr>
+        <w:pStyle w:val="ListBullet"/>
+      </w:pPr>
+      <w:r>
+        <w:t>A PDF rendering quirk occasionally splits a total row's leading digit into its own token ('6 6,152.58' instead of '66,152.58'); fixed in both the places it can occur — the text-reconstruction fallback above, and pdfplumber's native table-cell path, where the split digit and value land in the same cell as one string that the number parser correctly (by design) refuses to guess at.</w:t>
+      </w:r>
+    </w:p>
+    <w:p>
+      <w:pPr>
+        <w:pStyle w:val="ListBullet"/>
+      </w:pPr>
+      <w:r>
+        <w:t>The fuzzy-match threshold and candidate-selection audit described in Section 5.</w:t>
+      </w:r>
+    </w:p>
+    <w:p>
+      <w:pPr>
+        <w:pStyle w:val="ListBullet"/>
+      </w:pPr>
+      <w:r>
+        <w:t>PaddleOCR crash on scanned PDFs: PaddleX (which paddleocr 3.x is built on) enables an x86-only oneDNN CPU backend by default, which crashes on at least one op in the OCR pipeline on Cloud Run's CPUs — never reproduces on Apple Silicon, which doesn't use that backend at all. Fixed via PADDLE_PDX_ENABLE_MKLDNN_BYDEFAULT=False, set before paddleocr is ever imported.</w:t>
+      </w:r>
+    </w:p>
+    <w:p>
+      <w:pPr>
+        <w:pStyle w:val="ListBullet"/>
+      </w:pPr>
+      <w:r>
+        <w:t>Container memory raised from 16Gi to 32Gi after a large real scanned PDF (~19MB, 40+ pages) killed the request silently mid-OCR twice in a row — no Python exception, no app-level error, just a platform-level "request timed out or exited" warning and a cold restart a few minutes later. That signature (silent death, nothing catchable) is consistent with an OOM kill: PaddleOCR runs several models at once while holding page-image buffers for a many-page document, which the original 16Gi sizing (based on the LLM + embedding model baseline alone) didn't account for. Not yet re-confirmed against the same file post-bump.</w:t>
+      </w:r>
+    </w:p>
     <w:p>
       <w:r>
         <w:rPr>

</xml_diff>